<commit_message>
Short litle clean up
Python code is no more going to be used we are switching to c++ for input and output calculations are going to be in python

Draw io sketch added for the code
</commit_message>
<xml_diff>
--- a/docs/Robotics Union.docx
+++ b/docs/Robotics Union.docx
@@ -9,6 +9,7 @@
           <w:rFonts w:ascii="Aharoni" w:hAnsi="Aharoni" w:cs="Aharoni"/>
           <w:sz w:val="52"/>
           <w:szCs w:val="52"/>
+          <w:lang w:val="en-GB"/>
         </w:rPr>
       </w:pPr>
       <w:r>
@@ -16,6 +17,7 @@
           <w:rFonts w:ascii="Aharoni" w:hAnsi="Aharoni" w:cs="Aharoni" w:hint="cs"/>
           <w:sz w:val="52"/>
           <w:szCs w:val="52"/>
+          <w:lang w:val="en-GB"/>
         </w:rPr>
         <w:t>Robotics Union</w:t>
       </w:r>
@@ -24,7 +26,7 @@
       <w:pPr>
         <w:jc w:val="center"/>
         <w:rPr>
-          <w:rFonts w:ascii="Aharoni" w:hAnsi="Aharoni" w:cs="Aharoni" w:hint="cs"/>
+          <w:rFonts w:ascii="Aharoni" w:hAnsi="Aharoni" w:cs="Aharoni"/>
           <w:sz w:val="20"/>
           <w:szCs w:val="20"/>
           <w:lang w:val="en-GB"/>
@@ -145,25 +147,7 @@
                                 <w:rPr>
                                   <w:rStyle w:val="Hyperlink"/>
                                 </w:rPr>
-                                <w:t>Gi</w:t>
-                              </w:r>
-                              <w:r>
-                                <w:rPr>
-                                  <w:rStyle w:val="Hyperlink"/>
-                                </w:rPr>
-                                <w:t>t</w:t>
-                              </w:r>
-                              <w:r>
-                                <w:rPr>
-                                  <w:rStyle w:val="Hyperlink"/>
-                                </w:rPr>
-                                <w:t>H</w:t>
-                              </w:r>
-                              <w:r>
-                                <w:rPr>
-                                  <w:rStyle w:val="Hyperlink"/>
-                                </w:rPr>
-                                <w:t>ub</w:t>
+                                <w:t>GitHub</w:t>
                               </w:r>
                             </w:hyperlink>
                           </w:p>
@@ -295,10 +279,7 @@
                               <w:t>k</w:t>
                             </w:r>
                             <w:r>
-                              <w:t xml:space="preserve"> und </w:t>
-                            </w:r>
-                            <w:r>
-                              <w:t xml:space="preserve">Konstruktion </w:t>
+                              <w:t xml:space="preserve"> und Konstruktion </w:t>
                             </w:r>
                             <w:r>
                               <w:t>der Werkzeugwechselstation</w:t>
@@ -312,10 +293,16 @@
                               <w:t xml:space="preserve"> – </w:t>
                             </w:r>
                             <w:r>
-                              <w:t>Konstruktion des R</w:t>
-                            </w:r>
-                            <w:r>
-                              <w:t>obotersarmes, Berechnung</w:t>
+                              <w:t xml:space="preserve">Konstruktion des </w:t>
+                            </w:r>
+                            <w:r>
+                              <w:t>R</w:t>
+                            </w:r>
+                            <w:r>
+                              <w:t>oboter Armes</w:t>
+                            </w:r>
+                            <w:r>
+                              <w:t>, Berechnung</w:t>
                             </w:r>
                           </w:p>
                           <w:p/>
@@ -387,25 +374,7 @@
                           <w:rPr>
                             <w:rStyle w:val="Hyperlink"/>
                           </w:rPr>
-                          <w:t>Gi</w:t>
-                        </w:r>
-                        <w:r>
-                          <w:rPr>
-                            <w:rStyle w:val="Hyperlink"/>
-                          </w:rPr>
-                          <w:t>t</w:t>
-                        </w:r>
-                        <w:r>
-                          <w:rPr>
-                            <w:rStyle w:val="Hyperlink"/>
-                          </w:rPr>
-                          <w:t>H</w:t>
-                        </w:r>
-                        <w:r>
-                          <w:rPr>
-                            <w:rStyle w:val="Hyperlink"/>
-                          </w:rPr>
-                          <w:t>ub</w:t>
+                          <w:t>GitHub</w:t>
                         </w:r>
                       </w:hyperlink>
                     </w:p>
@@ -537,10 +506,7 @@
                         <w:t>k</w:t>
                       </w:r>
                       <w:r>
-                        <w:t xml:space="preserve"> und </w:t>
-                      </w:r>
-                      <w:r>
-                        <w:t xml:space="preserve">Konstruktion </w:t>
+                        <w:t xml:space="preserve"> und Konstruktion </w:t>
                       </w:r>
                       <w:r>
                         <w:t>der Werkzeugwechselstation</w:t>
@@ -554,10 +520,16 @@
                         <w:t xml:space="preserve"> – </w:t>
                       </w:r>
                       <w:r>
-                        <w:t>Konstruktion des R</w:t>
-                      </w:r>
-                      <w:r>
-                        <w:t>obotersarmes, Berechnung</w:t>
+                        <w:t xml:space="preserve">Konstruktion des </w:t>
+                      </w:r>
+                      <w:r>
+                        <w:t>R</w:t>
+                      </w:r>
+                      <w:r>
+                        <w:t>oboter Armes</w:t>
+                      </w:r>
+                      <w:r>
+                        <w:t>, Berechnung</w:t>
                       </w:r>
                     </w:p>
                     <w:p/>
@@ -674,6 +646,9 @@
         </mc:AlternateContent>
       </w:r>
       <w:r>
+        <w:rPr>
+          <w:noProof/>
+        </w:rPr>
         <w:drawing>
           <wp:anchor distT="0" distB="0" distL="114300" distR="114300" simplePos="0" relativeHeight="251658240" behindDoc="1" locked="0" layoutInCell="1" allowOverlap="1" wp14:anchorId="5E6BEDB5" wp14:editId="5F930E9D">
             <wp:simplePos x="0" y="0"/>
@@ -1203,6 +1178,7 @@
         <w:jc w:val="center"/>
         <w:rPr>
           <w:noProof/>
+          <w:lang w:val="en-GB"/>
         </w:rPr>
       </w:pPr>
     </w:p>
@@ -1211,6 +1187,7 @@
         <w:jc w:val="center"/>
         <w:rPr>
           <w:noProof/>
+          <w:lang w:val="en-GB"/>
         </w:rPr>
       </w:pPr>
     </w:p>
@@ -1219,6 +1196,7 @@
         <w:jc w:val="center"/>
         <w:rPr>
           <w:noProof/>
+          <w:lang w:val="en-GB"/>
         </w:rPr>
       </w:pPr>
     </w:p>
@@ -1227,6 +1205,7 @@
         <w:jc w:val="center"/>
         <w:rPr>
           <w:noProof/>
+          <w:lang w:val="en-GB"/>
         </w:rPr>
       </w:pPr>
     </w:p>
@@ -1235,6 +1214,7 @@
         <w:jc w:val="center"/>
         <w:rPr>
           <w:noProof/>
+          <w:lang w:val="en-GB"/>
         </w:rPr>
       </w:pPr>
     </w:p>
@@ -1243,6 +1223,7 @@
         <w:jc w:val="center"/>
         <w:rPr>
           <w:noProof/>
+          <w:lang w:val="en-GB"/>
         </w:rPr>
       </w:pPr>
     </w:p>
@@ -1251,6 +1232,7 @@
         <w:jc w:val="center"/>
         <w:rPr>
           <w:noProof/>
+          <w:lang w:val="en-GB"/>
         </w:rPr>
       </w:pPr>
     </w:p>
@@ -1259,6 +1241,7 @@
         <w:jc w:val="center"/>
         <w:rPr>
           <w:noProof/>
+          <w:lang w:val="en-GB"/>
         </w:rPr>
       </w:pPr>
     </w:p>
@@ -1267,6 +1250,7 @@
         <w:jc w:val="center"/>
         <w:rPr>
           <w:noProof/>
+          <w:lang w:val="en-GB"/>
         </w:rPr>
       </w:pPr>
     </w:p>
@@ -1275,6 +1259,7 @@
         <w:jc w:val="center"/>
         <w:rPr>
           <w:noProof/>
+          <w:lang w:val="en-GB"/>
         </w:rPr>
       </w:pPr>
     </w:p>
@@ -1283,6 +1268,7 @@
         <w:jc w:val="center"/>
         <w:rPr>
           <w:noProof/>
+          <w:lang w:val="en-GB"/>
         </w:rPr>
       </w:pPr>
     </w:p>
@@ -1291,22 +1277,32 @@
         <w:jc w:val="center"/>
         <w:rPr>
           <w:noProof/>
+          <w:lang w:val="en-GB"/>
         </w:rPr>
       </w:pPr>
     </w:p>
     <w:p>
       <w:pPr>
         <w:jc w:val="center"/>
+        <w:rPr>
+          <w:lang w:val="en-GB"/>
+        </w:rPr>
       </w:pPr>
     </w:p>
     <w:p>
       <w:pPr>
         <w:jc w:val="center"/>
+        <w:rPr>
+          <w:lang w:val="en-GB"/>
+        </w:rPr>
       </w:pPr>
     </w:p>
     <w:p>
       <w:pPr>
         <w:jc w:val="center"/>
+        <w:rPr>
+          <w:lang w:val="en-GB"/>
+        </w:rPr>
       </w:pPr>
     </w:p>
     <w:p>
@@ -1314,6 +1310,7 @@
         <w:jc w:val="center"/>
         <w:rPr>
           <w:noProof/>
+          <w:lang w:val="en-GB"/>
         </w:rPr>
       </w:pPr>
     </w:p>
@@ -1322,42 +1319,64 @@
         <w:jc w:val="center"/>
         <w:rPr>
           <w:noProof/>
+          <w:lang w:val="en-GB"/>
         </w:rPr>
       </w:pPr>
     </w:p>
     <w:p>
       <w:pPr>
         <w:jc w:val="center"/>
+        <w:rPr>
+          <w:lang w:val="en-GB"/>
+        </w:rPr>
       </w:pPr>
     </w:p>
     <w:p>
       <w:pPr>
         <w:jc w:val="center"/>
+        <w:rPr>
+          <w:lang w:val="en-GB"/>
+        </w:rPr>
       </w:pPr>
     </w:p>
     <w:p>
       <w:pPr>
         <w:jc w:val="center"/>
+        <w:rPr>
+          <w:lang w:val="en-GB"/>
+        </w:rPr>
       </w:pPr>
     </w:p>
     <w:p>
       <w:pPr>
         <w:jc w:val="center"/>
+        <w:rPr>
+          <w:lang w:val="en-GB"/>
+        </w:rPr>
       </w:pPr>
     </w:p>
     <w:p>
       <w:pPr>
         <w:jc w:val="center"/>
+        <w:rPr>
+          <w:lang w:val="en-GB"/>
+        </w:rPr>
       </w:pPr>
     </w:p>
     <w:p>
       <w:pPr>
         <w:jc w:val="center"/>
+        <w:rPr>
+          <w:lang w:val="en-GB"/>
+        </w:rPr>
       </w:pPr>
     </w:p>
     <w:p>
       <w:pPr>
         <w:jc w:val="center"/>
+        <w:rPr>
+          <w:lang w:val="en-GB"/>
+        </w:rPr>
       </w:pPr>
     </w:p>
     <w:p>
@@ -1458,6 +1477,7 @@
         <w:rPr>
           <w:b/>
           <w:bCs/>
+          <w:noProof/>
         </w:rPr>
         <w:drawing>
           <wp:anchor distT="0" distB="0" distL="114300" distR="114300" simplePos="0" relativeHeight="251662336" behindDoc="0" locked="0" layoutInCell="1" allowOverlap="1" wp14:anchorId="1541E4D2" wp14:editId="498CF275">
@@ -1645,7 +1665,7 @@
           <w:noProof/>
         </w:rPr>
         <w:drawing>
-          <wp:anchor distT="0" distB="0" distL="114300" distR="114300" simplePos="0" relativeHeight="251664384" behindDoc="1" locked="0" layoutInCell="1" allowOverlap="1" wp14:anchorId="0E0679FC" wp14:editId="1552306A">
+          <wp:anchor distT="0" distB="0" distL="114300" distR="114300" simplePos="0" relativeHeight="251664384" behindDoc="1" locked="0" layoutInCell="1" allowOverlap="1" wp14:anchorId="0E0679FC" wp14:editId="6E769695">
             <wp:simplePos x="0" y="0"/>
             <wp:positionH relativeFrom="column">
               <wp:posOffset>3564504</wp:posOffset>
@@ -3213,6 +3233,7 @@
         <w:rPr>
           <w:b/>
           <w:bCs/>
+          <w:noProof/>
         </w:rPr>
         <w:drawing>
           <wp:anchor distT="0" distB="0" distL="114300" distR="114300" simplePos="0" relativeHeight="251669504" behindDoc="1" locked="0" layoutInCell="1" allowOverlap="1" wp14:anchorId="25A34255" wp14:editId="320DA6BB">
@@ -3453,9 +3474,10 @@
         <w:rPr>
           <w:b/>
           <w:bCs/>
+          <w:noProof/>
         </w:rPr>
         <w:drawing>
-          <wp:anchor distT="0" distB="0" distL="114300" distR="114300" simplePos="0" relativeHeight="251686912" behindDoc="1" locked="0" layoutInCell="1" allowOverlap="1" wp14:anchorId="024DE879" wp14:editId="2C265F0F">
+          <wp:anchor distT="0" distB="0" distL="114300" distR="114300" simplePos="0" relativeHeight="251686912" behindDoc="1" locked="0" layoutInCell="1" allowOverlap="1" wp14:anchorId="024DE879" wp14:editId="03B26919">
             <wp:simplePos x="0" y="0"/>
             <wp:positionH relativeFrom="column">
               <wp:posOffset>3119120</wp:posOffset>
@@ -4453,6 +4475,7 @@
   <w:style w:type="character" w:default="1" w:styleId="Absatz-Standardschriftart">
     <w:name w:val="Default Paragraph Font"/>
     <w:uiPriority w:val="1"/>
+    <w:semiHidden/>
     <w:unhideWhenUsed/>
   </w:style>
   <w:style w:type="table" w:default="1" w:styleId="NormaleTabelle">

</xml_diff>